<commit_message>
Refinamiento del esquema de interpretación tras el análisis de la prueba 2, fortaleciendo la definición del escenario consumo_basico para enfatizar la consulta de valores cuantitativos ya registrados y reducir ambigüedades en la clasificación. Se documenta y añade el nuevo escenario de entrada presentacion_resultados, orientado a solicitudes de visualización y presentación de información energética, con el objetivo de mejorar la escalabilidad futura del sistema y evitar colisiones semánticas con escenarios de consulta. Se actualiza la signature del interpretador y las descripciones asociadas a notas y entradas inadmisibles, y se incorporan los ajustes correspondientes en la documentación de escenarios de entrada y salida, junto con nuevas pruebas comparativas para evaluar el comportamiento de distintos LLMs bajo el esquema actualizado
</commit_message>
<xml_diff>
--- a/Avances_Proyecto/Sobre la herramienta/Descripción de los escenarios de entrada y salida de la herramienta.docx
+++ b/Avances_Proyecto/Sobre la herramienta/Descripción de los escenarios de entrada y salida de la herramienta.docx
@@ -102,15 +102,7 @@
           <w:b/>
           <w:bCs/>
         </w:rPr>
-        <w:t xml:space="preserve"> </w:t>
-      </w:r>
-      <w:r>
-        <w:rPr>
-          <w:rFonts w:ascii="Times New Roman" w:hAnsi="Times New Roman" w:cs="Times New Roman"/>
-          <w:b/>
-          <w:bCs/>
-        </w:rPr>
-        <w:t>¿Cuál fue el consumo promedio diario del televisor durante la última semana?</w:t>
+        <w:t xml:space="preserve"> ¿Cuál fue el consumo promedio diario del televisor durante la última semana?</w:t>
       </w:r>
     </w:p>
     <w:p>
@@ -140,7 +132,15 @@
           <w:b/>
           <w:bCs/>
         </w:rPr>
-        <w:t>Muéstrame cuánta energía consumió la zona de la cocina ayer.</w:t>
+        <w:t>Dime</w:t>
+      </w:r>
+      <w:r>
+        <w:rPr>
+          <w:rFonts w:ascii="Times New Roman" w:hAnsi="Times New Roman" w:cs="Times New Roman"/>
+          <w:b/>
+          <w:bCs/>
+        </w:rPr>
+        <w:t xml:space="preserve"> cuánta energía consumió la zona de la cocina ayer.</w:t>
       </w:r>
     </w:p>
     <w:p>
@@ -296,13 +296,7 @@
         <w:rPr>
           <w:rFonts w:ascii="Times New Roman" w:hAnsi="Times New Roman" w:cs="Times New Roman"/>
         </w:rPr>
-        <w:t>que el sistema debe explorar los datos históricos para detectar desviaciones estadísticas, hábitos de uso ineficientes o posibles fallos en los dispositivos</w:t>
-      </w:r>
-      <w:r>
-        <w:rPr>
-          <w:rFonts w:ascii="Times New Roman" w:hAnsi="Times New Roman" w:cs="Times New Roman"/>
-        </w:rPr>
-        <w:t>.</w:t>
+        <w:t>que el sistema debe explorar los datos históricos para detectar desviaciones estadísticas, hábitos de uso ineficientes o posibles fallos en los dispositivos.</w:t>
       </w:r>
     </w:p>
     <w:p>
@@ -324,15 +318,7 @@
           <w:b/>
           <w:bCs/>
         </w:rPr>
-        <w:t xml:space="preserve"> </w:t>
-      </w:r>
-      <w:r>
-        <w:rPr>
-          <w:rFonts w:ascii="Times New Roman" w:hAnsi="Times New Roman" w:cs="Times New Roman"/>
-          <w:b/>
-          <w:bCs/>
-        </w:rPr>
-        <w:t>“Detecta si hubo picos de consumo anormales después de medianoche durante la última semana.</w:t>
+        <w:t xml:space="preserve"> “Detecta si hubo picos de consumo anormales después de medianoche durante la última semana.</w:t>
       </w:r>
     </w:p>
     <w:p>
@@ -354,15 +340,7 @@
           <w:b/>
           <w:bCs/>
         </w:rPr>
-        <w:t xml:space="preserve"> </w:t>
-      </w:r>
-      <w:r>
-        <w:rPr>
-          <w:rFonts w:ascii="Times New Roman" w:hAnsi="Times New Roman" w:cs="Times New Roman"/>
-          <w:b/>
-          <w:bCs/>
-        </w:rPr>
-        <w:t>¿Algún dispositivo ha mostrado un aumento constante en su consumo diario?</w:t>
+        <w:t xml:space="preserve"> ¿Algún dispositivo ha mostrado un aumento constante en su consumo diario?</w:t>
       </w:r>
     </w:p>
     <w:p>
@@ -545,7 +523,29 @@
           <w:i/>
           <w:iCs/>
         </w:rPr>
-        <w:t>(pregunta ambigua y sin contexto</w:t>
+        <w:t>(pregunta ambigua y sin contexto)</w:t>
+      </w:r>
+    </w:p>
+    <w:p>
+      <w:pPr>
+        <w:pStyle w:val="Prrafodelista"/>
+        <w:numPr>
+          <w:ilvl w:val="1"/>
+          <w:numId w:val="1"/>
+        </w:numPr>
+        <w:rPr>
+          <w:rFonts w:ascii="Times New Roman" w:hAnsi="Times New Roman" w:cs="Times New Roman"/>
+          <w:b/>
+          <w:bCs/>
+        </w:rPr>
+      </w:pPr>
+      <w:r>
+        <w:rPr>
+          <w:rFonts w:ascii="Times New Roman" w:hAnsi="Times New Roman" w:cs="Times New Roman"/>
+          <w:b/>
+          <w:bCs/>
+        </w:rPr>
+        <w:t xml:space="preserve"> Hazme un gráfico bonito del clima. </w:t>
       </w:r>
       <w:r>
         <w:rPr>
@@ -555,7 +555,7 @@
           <w:i/>
           <w:iCs/>
         </w:rPr>
-        <w:t>)</w:t>
+        <w:t>(fuera del dominio del sistema)</w:t>
       </w:r>
     </w:p>
     <w:p>
@@ -577,23 +577,7 @@
           <w:b/>
           <w:bCs/>
         </w:rPr>
-        <w:t xml:space="preserve"> </w:t>
-      </w:r>
-      <w:r>
-        <w:rPr>
-          <w:rFonts w:ascii="Times New Roman" w:hAnsi="Times New Roman" w:cs="Times New Roman"/>
-          <w:b/>
-          <w:bCs/>
-        </w:rPr>
-        <w:t>Hazme un gráfico bonito del clima.</w:t>
-      </w:r>
-      <w:r>
-        <w:rPr>
-          <w:rFonts w:ascii="Times New Roman" w:hAnsi="Times New Roman" w:cs="Times New Roman"/>
-          <w:b/>
-          <w:bCs/>
-        </w:rPr>
-        <w:t xml:space="preserve"> </w:t>
+        <w:t xml:space="preserve">Explica por qué el universo es tan grande. </w:t>
       </w:r>
       <w:r>
         <w:rPr>
@@ -603,40 +587,210 @@
           <w:i/>
           <w:iCs/>
         </w:rPr>
-        <w:t>(fuera del dominio del sistema)</w:t>
-      </w:r>
-    </w:p>
-    <w:p>
-      <w:pPr>
-        <w:pStyle w:val="Prrafodelista"/>
-        <w:numPr>
-          <w:ilvl w:val="1"/>
+        <w:t>(completamente irrelevante al contexto energético)</w:t>
+      </w:r>
+    </w:p>
+    <w:p>
+      <w:pPr>
+        <w:pStyle w:val="NormalWeb"/>
+      </w:pPr>
+      <w:r>
+        <w:t xml:space="preserve">Hasta este punto, el sistema contempla escenarios orientados a la </w:t>
+      </w:r>
+      <w:r>
+        <w:rPr>
+          <w:rStyle w:val="Textoennegrita"/>
+          <w:rFonts w:eastAsiaTheme="majorEastAsia"/>
+        </w:rPr>
+        <w:t>obtención</w:t>
+      </w:r>
+      <w:r>
+        <w:t xml:space="preserve">, </w:t>
+      </w:r>
+      <w:r>
+        <w:rPr>
+          <w:rStyle w:val="Textoennegrita"/>
+          <w:rFonts w:eastAsiaTheme="majorEastAsia"/>
+        </w:rPr>
+        <w:t>análisis</w:t>
+      </w:r>
+      <w:r>
+        <w:t xml:space="preserve"> y </w:t>
+      </w:r>
+      <w:r>
+        <w:rPr>
+          <w:rStyle w:val="Textoennegrita"/>
+          <w:rFonts w:eastAsiaTheme="majorEastAsia"/>
+        </w:rPr>
+        <w:t>proyección</w:t>
+      </w:r>
+      <w:r>
+        <w:t xml:space="preserve"> de información energética. Sin embargo, durante las pruebas se identificó un tipo de intención recurrente por parte del usuario que no encaja de forma natural en los escenarios existentes: solicitudes cuya finalidad no es consultar nuevos datos ni analizarlos, sino </w:t>
+      </w:r>
+      <w:r>
+        <w:rPr>
+          <w:rStyle w:val="Textoennegrita"/>
+          <w:rFonts w:eastAsiaTheme="majorEastAsia"/>
+        </w:rPr>
+        <w:t>definir cómo deben presentarse los resultados</w:t>
+      </w:r>
+      <w:r>
+        <w:t>.</w:t>
+      </w:r>
+    </w:p>
+    <w:p>
+      <w:pPr>
+        <w:pStyle w:val="NormalWeb"/>
+      </w:pPr>
+      <w:r>
+        <w:t xml:space="preserve">Actualmente, la herramienta </w:t>
+      </w:r>
+      <w:r>
+        <w:rPr>
+          <w:rStyle w:val="Textoennegrita"/>
+          <w:rFonts w:eastAsiaTheme="majorEastAsia"/>
+        </w:rPr>
+        <w:t>no implementa explícitamente</w:t>
+      </w:r>
+      <w:r>
+        <w:t xml:space="preserve"> este tipo de solicitudes como una capacidad funcional independiente. No obstante, se decide </w:t>
+      </w:r>
+      <w:r>
+        <w:rPr>
+          <w:rStyle w:val="Textoennegrita"/>
+          <w:rFonts w:eastAsiaTheme="majorEastAsia"/>
+        </w:rPr>
+        <w:t>documentar y reconocer formalmente este escenario</w:t>
+      </w:r>
+      <w:r>
+        <w:t xml:space="preserve"> con el objetivo de mejorar la escalabilidad futura del sistema, permitir una separación clara entre procesamiento de datos y presentación, y evitar ambigüedades en la interpretación de consultas relacionadas con gráficos o formatos visuales.</w:t>
+      </w:r>
+    </w:p>
+    <w:p>
+      <w:pPr>
+        <w:pStyle w:val="NormalWeb"/>
+      </w:pPr>
+      <w:r>
+        <w:t>La inclusión de este escenario permite desacoplar conceptualmente el análisis energético de su representación, facilitando la extensión futura del sistema hacia interfaces gráficas más avanzadas o módulos de visualización especializados.</w:t>
+      </w:r>
+      <w:r>
+        <w:t xml:space="preserve"> </w:t>
+      </w:r>
+      <w:r>
+        <w:t>En este contexto, se introduce el siguiente escenario adicional:</w:t>
+      </w:r>
+    </w:p>
+    <w:p>
+      <w:pPr>
+        <w:pStyle w:val="NormalWeb"/>
+        <w:numPr>
+          <w:ilvl w:val="0"/>
           <w:numId w:val="1"/>
         </w:numPr>
-        <w:rPr>
-          <w:rFonts w:ascii="Times New Roman" w:hAnsi="Times New Roman" w:cs="Times New Roman"/>
-          <w:b/>
-          <w:bCs/>
-        </w:rPr>
-      </w:pPr>
-      <w:r>
-        <w:rPr>
-          <w:rFonts w:ascii="Times New Roman" w:hAnsi="Times New Roman" w:cs="Times New Roman"/>
-          <w:b/>
-          <w:bCs/>
-        </w:rPr>
-        <w:t xml:space="preserve">Explica por qué el universo es tan grande. </w:t>
-      </w:r>
-      <w:r>
-        <w:rPr>
-          <w:rFonts w:ascii="Times New Roman" w:hAnsi="Times New Roman" w:cs="Times New Roman"/>
-          <w:b/>
-          <w:bCs/>
-          <w:i/>
-          <w:iCs/>
-        </w:rPr>
-        <w:t>(completamente irrelevante al contexto energético)</w:t>
-      </w:r>
+      </w:pPr>
+      <w:r>
+        <w:rPr>
+          <w:rStyle w:val="Textoennegrita"/>
+          <w:rFonts w:eastAsiaTheme="majorEastAsia"/>
+        </w:rPr>
+        <w:lastRenderedPageBreak/>
+        <w:t>Presentación de resultados y visualización</w:t>
+      </w:r>
+      <w:r>
+        <w:t xml:space="preserve">: </w:t>
+      </w:r>
+      <w:r>
+        <w:t xml:space="preserve">Este escenario agrupa las solicitudes en las que el usuario expresa una intención explícita de </w:t>
+      </w:r>
+      <w:r>
+        <w:rPr>
+          <w:rStyle w:val="Textoennegrita"/>
+          <w:rFonts w:eastAsiaTheme="majorEastAsia"/>
+        </w:rPr>
+        <w:t>visualizar, ilustrar o presentar</w:t>
+      </w:r>
+      <w:r>
+        <w:t xml:space="preserve"> información energética previamente obtenida, mediante gráficos, diagramas u otros formatos visuales. A diferencia de los escenarios anteriores, estas consultas no buscan calcular nuevos valores, comparar consumos ni detectar patrones, sino definir la </w:t>
+      </w:r>
+      <w:r>
+        <w:rPr>
+          <w:rStyle w:val="Textoennegrita"/>
+          <w:rFonts w:eastAsiaTheme="majorEastAsia"/>
+        </w:rPr>
+        <w:t>forma de comunicación de los resultados</w:t>
+      </w:r>
+      <w:r>
+        <w:t>.</w:t>
+      </w:r>
+    </w:p>
+    <w:p>
+      <w:pPr>
+        <w:pStyle w:val="NormalWeb"/>
+        <w:numPr>
+          <w:ilvl w:val="0"/>
+          <w:numId w:val="8"/>
+        </w:numPr>
+        <w:rPr>
+          <w:b/>
+          <w:bCs/>
+        </w:rPr>
+      </w:pPr>
+      <w:r>
+        <w:rPr>
+          <w:b/>
+          <w:bCs/>
+        </w:rPr>
+        <w:t>Muéstrame gráficas del consumo de todos los dispositivos en 2024.</w:t>
+      </w:r>
+    </w:p>
+    <w:p>
+      <w:pPr>
+        <w:pStyle w:val="NormalWeb"/>
+        <w:numPr>
+          <w:ilvl w:val="0"/>
+          <w:numId w:val="8"/>
+        </w:numPr>
+        <w:rPr>
+          <w:b/>
+          <w:bCs/>
+        </w:rPr>
+      </w:pPr>
+      <w:r>
+        <w:rPr>
+          <w:b/>
+          <w:bCs/>
+        </w:rPr>
+        <w:t>Quiero ver un gráfico del consumo diario de la nevera esta semana.</w:t>
+      </w:r>
+    </w:p>
+    <w:p>
+      <w:pPr>
+        <w:pStyle w:val="NormalWeb"/>
+        <w:numPr>
+          <w:ilvl w:val="0"/>
+          <w:numId w:val="8"/>
+        </w:numPr>
+        <w:rPr>
+          <w:b/>
+          <w:bCs/>
+        </w:rPr>
+      </w:pPr>
+      <w:r>
+        <w:rPr>
+          <w:b/>
+          <w:bCs/>
+        </w:rPr>
+        <w:t>Preséntame visualmente la información de consumo que acabamos de consultar.</w:t>
+      </w:r>
+    </w:p>
+    <w:p>
+      <w:pPr>
+        <w:pStyle w:val="NormalWeb"/>
+        <w:rPr>
+          <w:b/>
+          <w:bCs/>
+        </w:rPr>
+      </w:pPr>
     </w:p>
     <w:p>
       <w:pPr>
@@ -688,36 +842,61 @@
     <w:p>
       <w:pPr>
         <w:pStyle w:val="Prrafodelista"/>
-        <w:ind w:left="1416"/>
-        <w:rPr>
-          <w:rFonts w:ascii="Times New Roman" w:hAnsi="Times New Roman" w:cs="Times New Roman"/>
-        </w:rPr>
-      </w:pPr>
-      <w:r>
-        <w:rPr>
-          <w:rFonts w:ascii="Times New Roman" w:hAnsi="Times New Roman" w:cs="Times New Roman"/>
-          <w:b/>
-          <w:bCs/>
-        </w:rPr>
-        <w:t>a. El televisor consumió 1.85 kWh durante la última semana, con un promedio diario de 0.26 kWh.</w:t>
-      </w:r>
-      <w:r>
-        <w:rPr>
-          <w:rFonts w:ascii="Times New Roman" w:hAnsi="Times New Roman" w:cs="Times New Roman"/>
-          <w:b/>
-          <w:bCs/>
-        </w:rPr>
-        <w:br/>
-        <w:t>b. El consumo total de la zona de la cocina ayer fue de 4.2 kWh.</w:t>
-      </w:r>
-      <w:r>
-        <w:rPr>
-          <w:rFonts w:ascii="Times New Roman" w:hAnsi="Times New Roman" w:cs="Times New Roman"/>
-          <w:b/>
-          <w:bCs/>
-        </w:rPr>
-        <w:br/>
-        <w:t>c. El hogar registró un uso energético de 3.6 kWh entre las 6 p.m. y las 10 p.m.</w:t>
+        <w:numPr>
+          <w:ilvl w:val="0"/>
+          <w:numId w:val="10"/>
+        </w:numPr>
+        <w:rPr>
+          <w:rFonts w:ascii="Times New Roman" w:hAnsi="Times New Roman" w:cs="Times New Roman"/>
+        </w:rPr>
+      </w:pPr>
+      <w:r>
+        <w:rPr>
+          <w:rFonts w:ascii="Times New Roman" w:hAnsi="Times New Roman" w:cs="Times New Roman"/>
+          <w:b/>
+          <w:bCs/>
+        </w:rPr>
+        <w:t>El televisor consumió 1.85 kWh durante la última semana, con un promedio diario de 0.26 kWh.</w:t>
+      </w:r>
+    </w:p>
+    <w:p>
+      <w:pPr>
+        <w:pStyle w:val="Prrafodelista"/>
+        <w:numPr>
+          <w:ilvl w:val="0"/>
+          <w:numId w:val="10"/>
+        </w:numPr>
+        <w:rPr>
+          <w:rFonts w:ascii="Times New Roman" w:hAnsi="Times New Roman" w:cs="Times New Roman"/>
+        </w:rPr>
+      </w:pPr>
+      <w:r>
+        <w:rPr>
+          <w:rFonts w:ascii="Times New Roman" w:hAnsi="Times New Roman" w:cs="Times New Roman"/>
+          <w:b/>
+          <w:bCs/>
+        </w:rPr>
+        <w:t>El consumo total de la zona de la cocina ayer fue de 4.2 kWh.</w:t>
+      </w:r>
+    </w:p>
+    <w:p>
+      <w:pPr>
+        <w:pStyle w:val="Prrafodelista"/>
+        <w:numPr>
+          <w:ilvl w:val="0"/>
+          <w:numId w:val="10"/>
+        </w:numPr>
+        <w:rPr>
+          <w:rFonts w:ascii="Times New Roman" w:hAnsi="Times New Roman" w:cs="Times New Roman"/>
+        </w:rPr>
+      </w:pPr>
+      <w:r>
+        <w:rPr>
+          <w:rFonts w:ascii="Times New Roman" w:hAnsi="Times New Roman" w:cs="Times New Roman"/>
+          <w:b/>
+          <w:bCs/>
+        </w:rPr>
+        <w:t>El hogar registró un uso energético de 3.6 kWh entre las 6 p.m. y las 10 p.m.</w:t>
       </w:r>
     </w:p>
     <w:p>
@@ -745,14 +924,7 @@
         <w:rPr>
           <w:rFonts w:ascii="Times New Roman" w:hAnsi="Times New Roman" w:cs="Times New Roman"/>
         </w:rPr>
-        <w:t xml:space="preserve">Estas salidas surgen de solicitudes orientadas a comparar consumos entre dispositivos o periodos. El sistema no solo muestra los valores individuales, sino que también explica las diferencias, porcentajes de variación y posibles causas de la disparidad observada. Además del </w:t>
-      </w:r>
-      <w:r>
-        <w:rPr>
-          <w:rFonts w:ascii="Times New Roman" w:hAnsi="Times New Roman" w:cs="Times New Roman"/>
-        </w:rPr>
-        <w:lastRenderedPageBreak/>
-        <w:t>texto, puede incluir visualizaciones comparativas (barras o diagramas circulares) que representen la magnitud de los consumos y las relaciones entre ellos.</w:t>
+        <w:t>Estas salidas surgen de solicitudes orientadas a comparar consumos entre dispositivos o periodos. El sistema no solo muestra los valores individuales, sino que también explica las diferencias, porcentajes de variación y posibles causas de la disparidad observada. Además del texto, puede incluir visualizaciones comparativas (barras o diagramas circulares) que representen la magnitud de los consumos y las relaciones entre ellos.</w:t>
       </w:r>
     </w:p>
     <w:p>
@@ -838,27 +1010,20 @@
           <w:b/>
           <w:bCs/>
         </w:rPr>
-        <w:t>R</w:t>
-      </w:r>
-      <w:r>
-        <w:rPr>
-          <w:rFonts w:ascii="Times New Roman" w:hAnsi="Times New Roman" w:cs="Times New Roman"/>
-          <w:b/>
-          <w:bCs/>
-        </w:rPr>
-        <w:t>espuestas diagnósticas o de detección de anomalías:</w:t>
-      </w:r>
-      <w:r>
-        <w:rPr>
-          <w:rFonts w:ascii="Times New Roman" w:hAnsi="Times New Roman" w:cs="Times New Roman"/>
-        </w:rPr>
-        <w:t xml:space="preserve"> </w:t>
-      </w:r>
-      <w:r>
-        <w:rPr>
-          <w:rFonts w:ascii="Times New Roman" w:hAnsi="Times New Roman" w:cs="Times New Roman"/>
-        </w:rPr>
-        <w:t>En este escenario, el sistema identifica comportamientos irregulares o tendencias inusuales. La salida textual debe incluir una descripción clara del evento detectado, su posible causa y la magnitud de la desviación. Para favorecer la comprensión, pueden integrarse visualizaciones que resalten los puntos anómalos o las zonas de desviación sobre un gráfico temporal.</w:t>
+        <w:t>Respuestas diagnósticas o de detección de anomalías:</w:t>
+      </w:r>
+      <w:r>
+        <w:rPr>
+          <w:rFonts w:ascii="Times New Roman" w:hAnsi="Times New Roman" w:cs="Times New Roman"/>
+        </w:rPr>
+        <w:t xml:space="preserve"> En este escenario, el sistema identifica comportamientos irregulares o tendencias inusuales. La salida textual debe incluir una descripción clara del evento detectado, su posible causa y la magnitud de la desviación. Para favorecer la comprensión, pueden integrarse </w:t>
+      </w:r>
+      <w:r>
+        <w:rPr>
+          <w:rFonts w:ascii="Times New Roman" w:hAnsi="Times New Roman" w:cs="Times New Roman"/>
+        </w:rPr>
+        <w:lastRenderedPageBreak/>
+        <w:t>visualizaciones que resalten los puntos anómalos o las zonas de desviación sobre un gráfico temporal.</w:t>
       </w:r>
     </w:p>
     <w:p>
@@ -902,15 +1067,7 @@
           <w:b/>
           <w:bCs/>
         </w:rPr>
-        <w:t xml:space="preserve"> </w:t>
-      </w:r>
-      <w:r>
-        <w:rPr>
-          <w:rFonts w:ascii="Times New Roman" w:hAnsi="Times New Roman" w:cs="Times New Roman"/>
-          <w:b/>
-          <w:bCs/>
-        </w:rPr>
-        <w:t>La nevera presentó un incremento sostenido en su consumo diario durante los últimos cinco días, posiblemente asociado a un mal cierre de la puerta.</w:t>
+        <w:t xml:space="preserve"> La nevera presentó un incremento sostenido en su consumo diario durante los últimos cinco días, posiblemente asociado a un mal cierre de la puerta.</w:t>
       </w:r>
     </w:p>
     <w:p>
@@ -1004,15 +1161,7 @@
           <w:b/>
           <w:bCs/>
         </w:rPr>
-        <w:t>Si se mantienen los hábitos actuales, el consumo estimado para el próximo mes será de 86.4 kWh. Reducir el uso del aire acondicionado dos horas diarias podría disminuirlo en un 12%.</w:t>
-      </w:r>
-      <w:r>
-        <w:rPr>
-          <w:rFonts w:ascii="Times New Roman" w:hAnsi="Times New Roman" w:cs="Times New Roman"/>
-          <w:b/>
-          <w:bCs/>
-        </w:rPr>
-        <w:t xml:space="preserve"> </w:t>
+        <w:t xml:space="preserve">Si se mantienen los hábitos actuales, el consumo estimado para el próximo mes será de 86.4 kWh. Reducir el uso del aire acondicionado dos horas diarias podría disminuirlo en un 12%. </w:t>
       </w:r>
     </w:p>
     <w:p>
@@ -1082,7 +1231,6 @@
           <w:b/>
           <w:bCs/>
         </w:rPr>
-        <w:lastRenderedPageBreak/>
         <w:t xml:space="preserve">Respuesta a entradas inadmisibles o no interpretables: </w:t>
       </w:r>
       <w:r>
@@ -1120,49 +1268,71 @@
       </w:r>
     </w:p>
     <w:p>
-      <w:r>
-        <w:rPr>
-          <w:rFonts w:ascii="Times New Roman" w:hAnsi="Times New Roman" w:cs="Times New Roman"/>
-        </w:rPr>
-        <w:t>Adicionalmente a las salidas en formato textual mencionadas anteriormente, es posible utilizar el formato de imágenes y gráfic</w:t>
-      </w:r>
-      <w:r>
-        <w:rPr>
-          <w:rFonts w:ascii="Times New Roman" w:hAnsi="Times New Roman" w:cs="Times New Roman"/>
-        </w:rPr>
-        <w:t>o</w:t>
-      </w:r>
-      <w:r>
-        <w:rPr>
-          <w:rFonts w:ascii="Times New Roman" w:hAnsi="Times New Roman" w:cs="Times New Roman"/>
-        </w:rPr>
-        <w:t xml:space="preserve">s </w:t>
-      </w:r>
-      <w:r>
-        <w:rPr>
-          <w:rFonts w:ascii="Times New Roman" w:hAnsi="Times New Roman" w:cs="Times New Roman"/>
-        </w:rPr>
-        <w:t xml:space="preserve">de proyección temporal o simulaciones </w:t>
-      </w:r>
-      <w:r>
-        <w:rPr>
-          <w:rFonts w:ascii="Times New Roman" w:hAnsi="Times New Roman" w:cs="Times New Roman"/>
-        </w:rPr>
-        <w:t xml:space="preserve">para brindar </w:t>
-      </w:r>
-      <w:r>
-        <w:rPr>
-          <w:rFonts w:ascii="Times New Roman" w:hAnsi="Times New Roman" w:cs="Times New Roman"/>
-        </w:rPr>
-        <w:t>un apoyo visual en la</w:t>
-      </w:r>
-      <w:r>
-        <w:rPr>
-          <w:rFonts w:ascii="Times New Roman" w:hAnsi="Times New Roman" w:cs="Times New Roman"/>
-        </w:rPr>
-        <w:t xml:space="preserve"> explicación al usuario.</w:t>
-      </w:r>
-    </w:p>
+      <w:pPr>
+        <w:pStyle w:val="NormalWeb"/>
+      </w:pPr>
+      <w:r>
+        <w:lastRenderedPageBreak/>
+        <w:t>De forma análoga a los escenarios de entrada, las salidas del sistema se han definido para responder a distintos niveles de complejidad analítica. No obstante, al reconocer explícitamente solicitudes orientadas a la presentación de resultados, resulta necesario documentar también un tipo de salida asociado a este escenario, aun cuando su implementación completa se reserve para etapas posteriores del desarrollo.</w:t>
+      </w:r>
+    </w:p>
+    <w:p>
+      <w:pPr>
+        <w:pStyle w:val="NormalWeb"/>
+      </w:pPr>
+      <w:r>
+        <w:t xml:space="preserve">A </w:t>
+      </w:r>
+      <w:r>
+        <w:t>continuación,</w:t>
+      </w:r>
+      <w:r>
+        <w:t xml:space="preserve"> se incorpora un escenario adicional de salida, concebido como una extensión futura del sistema</w:t>
+      </w:r>
+      <w:r>
+        <w:t>.</w:t>
+      </w:r>
+    </w:p>
+    <w:p>
+      <w:pPr>
+        <w:pStyle w:val="NormalWeb"/>
+        <w:numPr>
+          <w:ilvl w:val="0"/>
+          <w:numId w:val="2"/>
+        </w:numPr>
+      </w:pPr>
+      <w:r>
+        <w:rPr>
+          <w:b/>
+          <w:bCs/>
+        </w:rPr>
+        <w:t>Respuestas de presentación o visualización</w:t>
+      </w:r>
+      <w:r>
+        <w:rPr>
+          <w:b/>
+          <w:bCs/>
+        </w:rPr>
+        <w:t>:</w:t>
+      </w:r>
+      <w:r>
+        <w:t xml:space="preserve"> </w:t>
+      </w:r>
+      <w:r>
+        <w:t xml:space="preserve">Este tipo de salida corresponde a solicitudes cuya intención principal es </w:t>
+      </w:r>
+      <w:r>
+        <w:rPr>
+          <w:b/>
+          <w:bCs/>
+        </w:rPr>
+        <w:t>mostrar o ilustrar</w:t>
+      </w:r>
+      <w:r>
+        <w:t xml:space="preserve"> información energética previamente procesada por el sistema. La respuesta se centra en la representación visual de los datos, ya sea mediante gráficos temporales, diagramas comparativos u otros recursos gráficos que faciliten la comprensión del usuario.</w:t>
+      </w:r>
+    </w:p>
+    <w:p/>
     <w:sectPr>
       <w:pgSz w:w="12240" w:h="15840"/>
       <w:pgMar w:top="1417" w:right="1701" w:bottom="1417" w:left="1701" w:header="708" w:footer="708" w:gutter="0"/>
@@ -1176,9 +1346,9 @@
 <file path=word/numbering.xml><?xml version="1.0" encoding="utf-8"?>
 <w:numbering xmlns:wpc="http://schemas.microsoft.com/office/word/2010/wordprocessingCanvas" xmlns:cx="http://schemas.microsoft.com/office/drawing/2014/chartex" xmlns:cx1="http://schemas.microsoft.com/office/drawing/2015/9/8/chartex" xmlns:cx2="http://schemas.microsoft.com/office/drawing/2015/10/21/chartex" xmlns:cx3="http://schemas.microsoft.com/office/drawing/2016/5/9/chartex" xmlns:cx4="http://schemas.microsoft.com/office/drawing/2016/5/10/chartex" xmlns:cx5="http://schemas.microsoft.com/office/drawing/2016/5/11/chartex" xmlns:cx6="http://schemas.microsoft.com/office/drawing/2016/5/12/chartex" xmlns:cx7="http://schemas.microsoft.com/office/drawing/2016/5/13/chartex" xmlns:cx8="http://schemas.microsoft.com/office/drawing/2016/5/14/chartex" xmlns:mc="http://schemas.openxmlformats.org/markup-compatibility/2006" xmlns:aink="http://schemas.microsoft.com/office/drawing/2016/ink" xmlns:am3d="http://schemas.microsoft.com/office/drawing/2017/model3d" xmlns:o="urn:schemas-microsoft-com:office:office" xmlns:oel="http://schemas.microsoft.com/office/2019/extlst" xmlns:r="http://schemas.openxmlformats.org/officeDocument/2006/relationships" xmlns:m="http://schemas.openxmlformats.org/officeDocument/2006/math" xmlns:v="urn:schemas-microsoft-com:vml" xmlns:wp14="http://schemas.microsoft.com/office/word/2010/wordprocessingDrawing" xmlns:wp="http://schemas.openxmlformats.org/drawingml/2006/wordprocessingDrawing" xmlns:w10="urn:schemas-microsoft-com:office:word" xmlns:w="http://schemas.openxmlformats.org/wordprocessingml/2006/main" xmlns:w14="http://schemas.microsoft.com/office/word/2010/wordml" xmlns:w15="http://schemas.microsoft.com/office/word/2012/wordml" xmlns:w16cex="http://schemas.microsoft.com/office/word/2018/wordml/cex" xmlns:w16cid="http://schemas.microsoft.com/office/word/2016/wordml/cid" xmlns:w16="http://schemas.microsoft.com/office/word/2018/wordml" xmlns:w16du="http://schemas.microsoft.com/office/word/2023/wordml/word16du" xmlns:w16sdtdh="http://schemas.microsoft.com/office/word/2020/wordml/sdtdatahash" xmlns:w16sdtfl="http://schemas.microsoft.com/office/word/2024/wordml/sdtformatlock" xmlns:w16se="http://schemas.microsoft.com/office/word/2015/wordml/symex" xmlns:wpg="http://schemas.microsoft.com/office/word/2010/wordprocessingGroup" xmlns:wpi="http://schemas.microsoft.com/office/word/2010/wordprocessingInk" xmlns:wne="http://schemas.microsoft.com/office/word/2006/wordml" xmlns:wps="http://schemas.microsoft.com/office/word/2010/wordprocessingShape" mc:Ignorable="w14 w15 w16se w16cid w16 w16cex w16sdtdh w16sdtfl w16du wp14">
   <w:abstractNum w:abstractNumId="0" w15:restartNumberingAfterBreak="0">
-    <w:nsid w:val="1D34156A"/>
+    <w:nsid w:val="051F380A"/>
     <w:multiLevelType w:val="hybridMultilevel"/>
-    <w:tmpl w:val="4B70659A"/>
+    <w:tmpl w:val="0E02B04E"/>
     <w:lvl w:ilvl="0" w:tplc="240A000F">
       <w:start w:val="1"/>
       <w:numFmt w:val="decimal"/>
@@ -1188,7 +1358,7 @@
         <w:ind w:left="720" w:hanging="360"/>
       </w:pPr>
     </w:lvl>
-    <w:lvl w:ilvl="1" w:tplc="240A0019">
+    <w:lvl w:ilvl="1" w:tplc="240A0019" w:tentative="1">
       <w:start w:val="1"/>
       <w:numFmt w:val="lowerLetter"/>
       <w:lvlText w:val="%2."/>
@@ -1262,6 +1432,182 @@
     </w:lvl>
   </w:abstractNum>
   <w:abstractNum w:abstractNumId="1" w15:restartNumberingAfterBreak="0">
+    <w:nsid w:val="09483E62"/>
+    <w:multiLevelType w:val="hybridMultilevel"/>
+    <w:tmpl w:val="CBA61A06"/>
+    <w:lvl w:ilvl="0" w:tplc="240A000F">
+      <w:start w:val="1"/>
+      <w:numFmt w:val="decimal"/>
+      <w:lvlText w:val="%1."/>
+      <w:lvlJc w:val="left"/>
+      <w:pPr>
+        <w:ind w:left="720" w:hanging="360"/>
+      </w:pPr>
+    </w:lvl>
+    <w:lvl w:ilvl="1" w:tplc="240A0019" w:tentative="1">
+      <w:start w:val="1"/>
+      <w:numFmt w:val="lowerLetter"/>
+      <w:lvlText w:val="%2."/>
+      <w:lvlJc w:val="left"/>
+      <w:pPr>
+        <w:ind w:left="1440" w:hanging="360"/>
+      </w:pPr>
+    </w:lvl>
+    <w:lvl w:ilvl="2" w:tplc="240A001B" w:tentative="1">
+      <w:start w:val="1"/>
+      <w:numFmt w:val="lowerRoman"/>
+      <w:lvlText w:val="%3."/>
+      <w:lvlJc w:val="right"/>
+      <w:pPr>
+        <w:ind w:left="2160" w:hanging="180"/>
+      </w:pPr>
+    </w:lvl>
+    <w:lvl w:ilvl="3" w:tplc="240A000F" w:tentative="1">
+      <w:start w:val="1"/>
+      <w:numFmt w:val="decimal"/>
+      <w:lvlText w:val="%4."/>
+      <w:lvlJc w:val="left"/>
+      <w:pPr>
+        <w:ind w:left="2880" w:hanging="360"/>
+      </w:pPr>
+    </w:lvl>
+    <w:lvl w:ilvl="4" w:tplc="240A0019" w:tentative="1">
+      <w:start w:val="1"/>
+      <w:numFmt w:val="lowerLetter"/>
+      <w:lvlText w:val="%5."/>
+      <w:lvlJc w:val="left"/>
+      <w:pPr>
+        <w:ind w:left="3600" w:hanging="360"/>
+      </w:pPr>
+    </w:lvl>
+    <w:lvl w:ilvl="5" w:tplc="240A001B" w:tentative="1">
+      <w:start w:val="1"/>
+      <w:numFmt w:val="lowerRoman"/>
+      <w:lvlText w:val="%6."/>
+      <w:lvlJc w:val="right"/>
+      <w:pPr>
+        <w:ind w:left="4320" w:hanging="180"/>
+      </w:pPr>
+    </w:lvl>
+    <w:lvl w:ilvl="6" w:tplc="240A000F" w:tentative="1">
+      <w:start w:val="1"/>
+      <w:numFmt w:val="decimal"/>
+      <w:lvlText w:val="%7."/>
+      <w:lvlJc w:val="left"/>
+      <w:pPr>
+        <w:ind w:left="5040" w:hanging="360"/>
+      </w:pPr>
+    </w:lvl>
+    <w:lvl w:ilvl="7" w:tplc="240A0019" w:tentative="1">
+      <w:start w:val="1"/>
+      <w:numFmt w:val="lowerLetter"/>
+      <w:lvlText w:val="%8."/>
+      <w:lvlJc w:val="left"/>
+      <w:pPr>
+        <w:ind w:left="5760" w:hanging="360"/>
+      </w:pPr>
+    </w:lvl>
+    <w:lvl w:ilvl="8" w:tplc="240A001B" w:tentative="1">
+      <w:start w:val="1"/>
+      <w:numFmt w:val="lowerRoman"/>
+      <w:lvlText w:val="%9."/>
+      <w:lvlJc w:val="right"/>
+      <w:pPr>
+        <w:ind w:left="6480" w:hanging="180"/>
+      </w:pPr>
+    </w:lvl>
+  </w:abstractNum>
+  <w:abstractNum w:abstractNumId="2" w15:restartNumberingAfterBreak="0">
+    <w:nsid w:val="1D34156A"/>
+    <w:multiLevelType w:val="hybridMultilevel"/>
+    <w:tmpl w:val="1BBC8092"/>
+    <w:lvl w:ilvl="0" w:tplc="D3E48554">
+      <w:start w:val="1"/>
+      <w:numFmt w:val="decimal"/>
+      <w:lvlText w:val="%1."/>
+      <w:lvlJc w:val="left"/>
+      <w:pPr>
+        <w:ind w:left="720" w:hanging="360"/>
+      </w:pPr>
+      <w:rPr>
+        <w:b/>
+        <w:bCs/>
+      </w:rPr>
+    </w:lvl>
+    <w:lvl w:ilvl="1" w:tplc="240A0019">
+      <w:start w:val="1"/>
+      <w:numFmt w:val="lowerLetter"/>
+      <w:lvlText w:val="%2."/>
+      <w:lvlJc w:val="left"/>
+      <w:pPr>
+        <w:ind w:left="1440" w:hanging="360"/>
+      </w:pPr>
+    </w:lvl>
+    <w:lvl w:ilvl="2" w:tplc="240A001B" w:tentative="1">
+      <w:start w:val="1"/>
+      <w:numFmt w:val="lowerRoman"/>
+      <w:lvlText w:val="%3."/>
+      <w:lvlJc w:val="right"/>
+      <w:pPr>
+        <w:ind w:left="2160" w:hanging="180"/>
+      </w:pPr>
+    </w:lvl>
+    <w:lvl w:ilvl="3" w:tplc="240A000F" w:tentative="1">
+      <w:start w:val="1"/>
+      <w:numFmt w:val="decimal"/>
+      <w:lvlText w:val="%4."/>
+      <w:lvlJc w:val="left"/>
+      <w:pPr>
+        <w:ind w:left="2880" w:hanging="360"/>
+      </w:pPr>
+    </w:lvl>
+    <w:lvl w:ilvl="4" w:tplc="240A0019" w:tentative="1">
+      <w:start w:val="1"/>
+      <w:numFmt w:val="lowerLetter"/>
+      <w:lvlText w:val="%5."/>
+      <w:lvlJc w:val="left"/>
+      <w:pPr>
+        <w:ind w:left="3600" w:hanging="360"/>
+      </w:pPr>
+    </w:lvl>
+    <w:lvl w:ilvl="5" w:tplc="240A001B" w:tentative="1">
+      <w:start w:val="1"/>
+      <w:numFmt w:val="lowerRoman"/>
+      <w:lvlText w:val="%6."/>
+      <w:lvlJc w:val="right"/>
+      <w:pPr>
+        <w:ind w:left="4320" w:hanging="180"/>
+      </w:pPr>
+    </w:lvl>
+    <w:lvl w:ilvl="6" w:tplc="240A000F" w:tentative="1">
+      <w:start w:val="1"/>
+      <w:numFmt w:val="decimal"/>
+      <w:lvlText w:val="%7."/>
+      <w:lvlJc w:val="left"/>
+      <w:pPr>
+        <w:ind w:left="5040" w:hanging="360"/>
+      </w:pPr>
+    </w:lvl>
+    <w:lvl w:ilvl="7" w:tplc="240A0019" w:tentative="1">
+      <w:start w:val="1"/>
+      <w:numFmt w:val="lowerLetter"/>
+      <w:lvlText w:val="%8."/>
+      <w:lvlJc w:val="left"/>
+      <w:pPr>
+        <w:ind w:left="5760" w:hanging="360"/>
+      </w:pPr>
+    </w:lvl>
+    <w:lvl w:ilvl="8" w:tplc="240A001B" w:tentative="1">
+      <w:start w:val="1"/>
+      <w:numFmt w:val="lowerRoman"/>
+      <w:lvlText w:val="%9."/>
+      <w:lvlJc w:val="right"/>
+      <w:pPr>
+        <w:ind w:left="6480" w:hanging="180"/>
+      </w:pPr>
+    </w:lvl>
+  </w:abstractNum>
+  <w:abstractNum w:abstractNumId="3" w15:restartNumberingAfterBreak="0">
     <w:nsid w:val="486C105A"/>
     <w:multiLevelType w:val="hybridMultilevel"/>
     <w:tmpl w:val="E57C662E"/>
@@ -1347,7 +1693,269 @@
       </w:pPr>
     </w:lvl>
   </w:abstractNum>
-  <w:abstractNum w:abstractNumId="2" w15:restartNumberingAfterBreak="0">
+  <w:abstractNum w:abstractNumId="4" w15:restartNumberingAfterBreak="0">
+    <w:nsid w:val="56B63B0F"/>
+    <w:multiLevelType w:val="hybridMultilevel"/>
+    <w:tmpl w:val="F8CA0D92"/>
+    <w:lvl w:ilvl="0" w:tplc="240A0017">
+      <w:start w:val="1"/>
+      <w:numFmt w:val="lowerLetter"/>
+      <w:lvlText w:val="%1)"/>
+      <w:lvlJc w:val="left"/>
+      <w:pPr>
+        <w:ind w:left="720" w:hanging="360"/>
+      </w:pPr>
+    </w:lvl>
+    <w:lvl w:ilvl="1" w:tplc="240A0019" w:tentative="1">
+      <w:start w:val="1"/>
+      <w:numFmt w:val="lowerLetter"/>
+      <w:lvlText w:val="%2."/>
+      <w:lvlJc w:val="left"/>
+      <w:pPr>
+        <w:ind w:left="1440" w:hanging="360"/>
+      </w:pPr>
+    </w:lvl>
+    <w:lvl w:ilvl="2" w:tplc="240A001B" w:tentative="1">
+      <w:start w:val="1"/>
+      <w:numFmt w:val="lowerRoman"/>
+      <w:lvlText w:val="%3."/>
+      <w:lvlJc w:val="right"/>
+      <w:pPr>
+        <w:ind w:left="2160" w:hanging="180"/>
+      </w:pPr>
+    </w:lvl>
+    <w:lvl w:ilvl="3" w:tplc="240A000F" w:tentative="1">
+      <w:start w:val="1"/>
+      <w:numFmt w:val="decimal"/>
+      <w:lvlText w:val="%4."/>
+      <w:lvlJc w:val="left"/>
+      <w:pPr>
+        <w:ind w:left="2880" w:hanging="360"/>
+      </w:pPr>
+    </w:lvl>
+    <w:lvl w:ilvl="4" w:tplc="240A0019" w:tentative="1">
+      <w:start w:val="1"/>
+      <w:numFmt w:val="lowerLetter"/>
+      <w:lvlText w:val="%5."/>
+      <w:lvlJc w:val="left"/>
+      <w:pPr>
+        <w:ind w:left="3600" w:hanging="360"/>
+      </w:pPr>
+    </w:lvl>
+    <w:lvl w:ilvl="5" w:tplc="240A001B" w:tentative="1">
+      <w:start w:val="1"/>
+      <w:numFmt w:val="lowerRoman"/>
+      <w:lvlText w:val="%6."/>
+      <w:lvlJc w:val="right"/>
+      <w:pPr>
+        <w:ind w:left="4320" w:hanging="180"/>
+      </w:pPr>
+    </w:lvl>
+    <w:lvl w:ilvl="6" w:tplc="240A000F" w:tentative="1">
+      <w:start w:val="1"/>
+      <w:numFmt w:val="decimal"/>
+      <w:lvlText w:val="%7."/>
+      <w:lvlJc w:val="left"/>
+      <w:pPr>
+        <w:ind w:left="5040" w:hanging="360"/>
+      </w:pPr>
+    </w:lvl>
+    <w:lvl w:ilvl="7" w:tplc="240A0019" w:tentative="1">
+      <w:start w:val="1"/>
+      <w:numFmt w:val="lowerLetter"/>
+      <w:lvlText w:val="%8."/>
+      <w:lvlJc w:val="left"/>
+      <w:pPr>
+        <w:ind w:left="5760" w:hanging="360"/>
+      </w:pPr>
+    </w:lvl>
+    <w:lvl w:ilvl="8" w:tplc="240A001B" w:tentative="1">
+      <w:start w:val="1"/>
+      <w:numFmt w:val="lowerRoman"/>
+      <w:lvlText w:val="%9."/>
+      <w:lvlJc w:val="right"/>
+      <w:pPr>
+        <w:ind w:left="6480" w:hanging="180"/>
+      </w:pPr>
+    </w:lvl>
+  </w:abstractNum>
+  <w:abstractNum w:abstractNumId="5" w15:restartNumberingAfterBreak="0">
+    <w:nsid w:val="63CD0EB9"/>
+    <w:multiLevelType w:val="hybridMultilevel"/>
+    <w:tmpl w:val="7EF26C20"/>
+    <w:lvl w:ilvl="0" w:tplc="8B78EBB6">
+      <w:start w:val="1"/>
+      <w:numFmt w:val="lowerLetter"/>
+      <w:lvlText w:val="%1."/>
+      <w:lvlJc w:val="left"/>
+      <w:pPr>
+        <w:ind w:left="1440" w:hanging="360"/>
+      </w:pPr>
+      <w:rPr>
+        <w:b/>
+        <w:bCs/>
+      </w:rPr>
+    </w:lvl>
+    <w:lvl w:ilvl="1" w:tplc="240A0019" w:tentative="1">
+      <w:start w:val="1"/>
+      <w:numFmt w:val="lowerLetter"/>
+      <w:lvlText w:val="%2."/>
+      <w:lvlJc w:val="left"/>
+      <w:pPr>
+        <w:ind w:left="2160" w:hanging="360"/>
+      </w:pPr>
+    </w:lvl>
+    <w:lvl w:ilvl="2" w:tplc="240A001B" w:tentative="1">
+      <w:start w:val="1"/>
+      <w:numFmt w:val="lowerRoman"/>
+      <w:lvlText w:val="%3."/>
+      <w:lvlJc w:val="right"/>
+      <w:pPr>
+        <w:ind w:left="2880" w:hanging="180"/>
+      </w:pPr>
+    </w:lvl>
+    <w:lvl w:ilvl="3" w:tplc="240A000F" w:tentative="1">
+      <w:start w:val="1"/>
+      <w:numFmt w:val="decimal"/>
+      <w:lvlText w:val="%4."/>
+      <w:lvlJc w:val="left"/>
+      <w:pPr>
+        <w:ind w:left="3600" w:hanging="360"/>
+      </w:pPr>
+    </w:lvl>
+    <w:lvl w:ilvl="4" w:tplc="240A0019" w:tentative="1">
+      <w:start w:val="1"/>
+      <w:numFmt w:val="lowerLetter"/>
+      <w:lvlText w:val="%5."/>
+      <w:lvlJc w:val="left"/>
+      <w:pPr>
+        <w:ind w:left="4320" w:hanging="360"/>
+      </w:pPr>
+    </w:lvl>
+    <w:lvl w:ilvl="5" w:tplc="240A001B" w:tentative="1">
+      <w:start w:val="1"/>
+      <w:numFmt w:val="lowerRoman"/>
+      <w:lvlText w:val="%6."/>
+      <w:lvlJc w:val="right"/>
+      <w:pPr>
+        <w:ind w:left="5040" w:hanging="180"/>
+      </w:pPr>
+    </w:lvl>
+    <w:lvl w:ilvl="6" w:tplc="240A000F" w:tentative="1">
+      <w:start w:val="1"/>
+      <w:numFmt w:val="decimal"/>
+      <w:lvlText w:val="%7."/>
+      <w:lvlJc w:val="left"/>
+      <w:pPr>
+        <w:ind w:left="5760" w:hanging="360"/>
+      </w:pPr>
+    </w:lvl>
+    <w:lvl w:ilvl="7" w:tplc="240A0019" w:tentative="1">
+      <w:start w:val="1"/>
+      <w:numFmt w:val="lowerLetter"/>
+      <w:lvlText w:val="%8."/>
+      <w:lvlJc w:val="left"/>
+      <w:pPr>
+        <w:ind w:left="6480" w:hanging="360"/>
+      </w:pPr>
+    </w:lvl>
+    <w:lvl w:ilvl="8" w:tplc="240A001B" w:tentative="1">
+      <w:start w:val="1"/>
+      <w:numFmt w:val="lowerRoman"/>
+      <w:lvlText w:val="%9."/>
+      <w:lvlJc w:val="right"/>
+      <w:pPr>
+        <w:ind w:left="7200" w:hanging="180"/>
+      </w:pPr>
+    </w:lvl>
+  </w:abstractNum>
+  <w:abstractNum w:abstractNumId="6" w15:restartNumberingAfterBreak="0">
+    <w:nsid w:val="67864FB8"/>
+    <w:multiLevelType w:val="hybridMultilevel"/>
+    <w:tmpl w:val="0CF2130E"/>
+    <w:lvl w:ilvl="0" w:tplc="240A0017">
+      <w:start w:val="1"/>
+      <w:numFmt w:val="lowerLetter"/>
+      <w:lvlText w:val="%1)"/>
+      <w:lvlJc w:val="left"/>
+      <w:pPr>
+        <w:ind w:left="1440" w:hanging="360"/>
+      </w:pPr>
+    </w:lvl>
+    <w:lvl w:ilvl="1" w:tplc="240A0019" w:tentative="1">
+      <w:start w:val="1"/>
+      <w:numFmt w:val="lowerLetter"/>
+      <w:lvlText w:val="%2."/>
+      <w:lvlJc w:val="left"/>
+      <w:pPr>
+        <w:ind w:left="2160" w:hanging="360"/>
+      </w:pPr>
+    </w:lvl>
+    <w:lvl w:ilvl="2" w:tplc="240A001B" w:tentative="1">
+      <w:start w:val="1"/>
+      <w:numFmt w:val="lowerRoman"/>
+      <w:lvlText w:val="%3."/>
+      <w:lvlJc w:val="right"/>
+      <w:pPr>
+        <w:ind w:left="2880" w:hanging="180"/>
+      </w:pPr>
+    </w:lvl>
+    <w:lvl w:ilvl="3" w:tplc="240A000F" w:tentative="1">
+      <w:start w:val="1"/>
+      <w:numFmt w:val="decimal"/>
+      <w:lvlText w:val="%4."/>
+      <w:lvlJc w:val="left"/>
+      <w:pPr>
+        <w:ind w:left="3600" w:hanging="360"/>
+      </w:pPr>
+    </w:lvl>
+    <w:lvl w:ilvl="4" w:tplc="240A0019" w:tentative="1">
+      <w:start w:val="1"/>
+      <w:numFmt w:val="lowerLetter"/>
+      <w:lvlText w:val="%5."/>
+      <w:lvlJc w:val="left"/>
+      <w:pPr>
+        <w:ind w:left="4320" w:hanging="360"/>
+      </w:pPr>
+    </w:lvl>
+    <w:lvl w:ilvl="5" w:tplc="240A001B" w:tentative="1">
+      <w:start w:val="1"/>
+      <w:numFmt w:val="lowerRoman"/>
+      <w:lvlText w:val="%6."/>
+      <w:lvlJc w:val="right"/>
+      <w:pPr>
+        <w:ind w:left="5040" w:hanging="180"/>
+      </w:pPr>
+    </w:lvl>
+    <w:lvl w:ilvl="6" w:tplc="240A000F" w:tentative="1">
+      <w:start w:val="1"/>
+      <w:numFmt w:val="decimal"/>
+      <w:lvlText w:val="%7."/>
+      <w:lvlJc w:val="left"/>
+      <w:pPr>
+        <w:ind w:left="5760" w:hanging="360"/>
+      </w:pPr>
+    </w:lvl>
+    <w:lvl w:ilvl="7" w:tplc="240A0019" w:tentative="1">
+      <w:start w:val="1"/>
+      <w:numFmt w:val="lowerLetter"/>
+      <w:lvlText w:val="%8."/>
+      <w:lvlJc w:val="left"/>
+      <w:pPr>
+        <w:ind w:left="6480" w:hanging="360"/>
+      </w:pPr>
+    </w:lvl>
+    <w:lvl w:ilvl="8" w:tplc="240A001B" w:tentative="1">
+      <w:start w:val="1"/>
+      <w:numFmt w:val="lowerRoman"/>
+      <w:lvlText w:val="%9."/>
+      <w:lvlJc w:val="right"/>
+      <w:pPr>
+        <w:ind w:left="7200" w:hanging="180"/>
+      </w:pPr>
+    </w:lvl>
+  </w:abstractNum>
+  <w:abstractNum w:abstractNumId="7" w15:restartNumberingAfterBreak="0">
     <w:nsid w:val="74E950F7"/>
     <w:multiLevelType w:val="hybridMultilevel"/>
     <w:tmpl w:val="A952572C"/>
@@ -1433,11 +2041,11 @@
       </w:pPr>
     </w:lvl>
   </w:abstractNum>
-  <w:abstractNum w:abstractNumId="3" w15:restartNumberingAfterBreak="0">
+  <w:abstractNum w:abstractNumId="8" w15:restartNumberingAfterBreak="0">
     <w:nsid w:val="792F4273"/>
     <w:multiLevelType w:val="hybridMultilevel"/>
-    <w:tmpl w:val="A952572C"/>
-    <w:lvl w:ilvl="0" w:tplc="240A000F">
+    <w:tmpl w:val="6DEC7516"/>
+    <w:lvl w:ilvl="0" w:tplc="601229CE">
       <w:start w:val="1"/>
       <w:numFmt w:val="decimal"/>
       <w:lvlText w:val="%1."/>
@@ -1445,6 +2053,10 @@
       <w:pPr>
         <w:ind w:left="720" w:hanging="360"/>
       </w:pPr>
+      <w:rPr>
+        <w:b/>
+        <w:bCs/>
+      </w:rPr>
     </w:lvl>
     <w:lvl w:ilvl="1" w:tplc="240A0019">
       <w:start w:val="1"/>
@@ -1519,17 +2131,121 @@
       </w:pPr>
     </w:lvl>
   </w:abstractNum>
+  <w:abstractNum w:abstractNumId="9" w15:restartNumberingAfterBreak="0">
+    <w:nsid w:val="7F1D427D"/>
+    <w:multiLevelType w:val="hybridMultilevel"/>
+    <w:tmpl w:val="7AB042B0"/>
+    <w:lvl w:ilvl="0" w:tplc="240A0019">
+      <w:start w:val="1"/>
+      <w:numFmt w:val="lowerLetter"/>
+      <w:lvlText w:val="%1."/>
+      <w:lvlJc w:val="left"/>
+      <w:pPr>
+        <w:ind w:left="1440" w:hanging="360"/>
+      </w:pPr>
+    </w:lvl>
+    <w:lvl w:ilvl="1" w:tplc="240A0019" w:tentative="1">
+      <w:start w:val="1"/>
+      <w:numFmt w:val="lowerLetter"/>
+      <w:lvlText w:val="%2."/>
+      <w:lvlJc w:val="left"/>
+      <w:pPr>
+        <w:ind w:left="2160" w:hanging="360"/>
+      </w:pPr>
+    </w:lvl>
+    <w:lvl w:ilvl="2" w:tplc="240A001B" w:tentative="1">
+      <w:start w:val="1"/>
+      <w:numFmt w:val="lowerRoman"/>
+      <w:lvlText w:val="%3."/>
+      <w:lvlJc w:val="right"/>
+      <w:pPr>
+        <w:ind w:left="2880" w:hanging="180"/>
+      </w:pPr>
+    </w:lvl>
+    <w:lvl w:ilvl="3" w:tplc="240A000F" w:tentative="1">
+      <w:start w:val="1"/>
+      <w:numFmt w:val="decimal"/>
+      <w:lvlText w:val="%4."/>
+      <w:lvlJc w:val="left"/>
+      <w:pPr>
+        <w:ind w:left="3600" w:hanging="360"/>
+      </w:pPr>
+    </w:lvl>
+    <w:lvl w:ilvl="4" w:tplc="240A0019" w:tentative="1">
+      <w:start w:val="1"/>
+      <w:numFmt w:val="lowerLetter"/>
+      <w:lvlText w:val="%5."/>
+      <w:lvlJc w:val="left"/>
+      <w:pPr>
+        <w:ind w:left="4320" w:hanging="360"/>
+      </w:pPr>
+    </w:lvl>
+    <w:lvl w:ilvl="5" w:tplc="240A001B" w:tentative="1">
+      <w:start w:val="1"/>
+      <w:numFmt w:val="lowerRoman"/>
+      <w:lvlText w:val="%6."/>
+      <w:lvlJc w:val="right"/>
+      <w:pPr>
+        <w:ind w:left="5040" w:hanging="180"/>
+      </w:pPr>
+    </w:lvl>
+    <w:lvl w:ilvl="6" w:tplc="240A000F" w:tentative="1">
+      <w:start w:val="1"/>
+      <w:numFmt w:val="decimal"/>
+      <w:lvlText w:val="%7."/>
+      <w:lvlJc w:val="left"/>
+      <w:pPr>
+        <w:ind w:left="5760" w:hanging="360"/>
+      </w:pPr>
+    </w:lvl>
+    <w:lvl w:ilvl="7" w:tplc="240A0019" w:tentative="1">
+      <w:start w:val="1"/>
+      <w:numFmt w:val="lowerLetter"/>
+      <w:lvlText w:val="%8."/>
+      <w:lvlJc w:val="left"/>
+      <w:pPr>
+        <w:ind w:left="6480" w:hanging="360"/>
+      </w:pPr>
+    </w:lvl>
+    <w:lvl w:ilvl="8" w:tplc="240A001B" w:tentative="1">
+      <w:start w:val="1"/>
+      <w:numFmt w:val="lowerRoman"/>
+      <w:lvlText w:val="%9."/>
+      <w:lvlJc w:val="right"/>
+      <w:pPr>
+        <w:ind w:left="7200" w:hanging="180"/>
+      </w:pPr>
+    </w:lvl>
+  </w:abstractNum>
   <w:num w:numId="1" w16cid:durableId="742064184">
+    <w:abstractNumId w:val="2"/>
+  </w:num>
+  <w:num w:numId="2" w16cid:durableId="741488005">
+    <w:abstractNumId w:val="8"/>
+  </w:num>
+  <w:num w:numId="3" w16cid:durableId="1360815025">
+    <w:abstractNumId w:val="3"/>
+  </w:num>
+  <w:num w:numId="4" w16cid:durableId="1690794748">
+    <w:abstractNumId w:val="7"/>
+  </w:num>
+  <w:num w:numId="5" w16cid:durableId="642927489">
+    <w:abstractNumId w:val="6"/>
+  </w:num>
+  <w:num w:numId="6" w16cid:durableId="1684472993">
+    <w:abstractNumId w:val="4"/>
+  </w:num>
+  <w:num w:numId="7" w16cid:durableId="156769368">
+    <w:abstractNumId w:val="1"/>
+  </w:num>
+  <w:num w:numId="8" w16cid:durableId="396823462">
+    <w:abstractNumId w:val="9"/>
+  </w:num>
+  <w:num w:numId="9" w16cid:durableId="1468812266">
     <w:abstractNumId w:val="0"/>
   </w:num>
-  <w:num w:numId="2" w16cid:durableId="741488005">
-    <w:abstractNumId w:val="3"/>
-  </w:num>
-  <w:num w:numId="3" w16cid:durableId="1360815025">
-    <w:abstractNumId w:val="1"/>
-  </w:num>
-  <w:num w:numId="4" w16cid:durableId="1690794748">
-    <w:abstractNumId w:val="2"/>
+  <w:num w:numId="10" w16cid:durableId="1157959142">
+    <w:abstractNumId w:val="5"/>
   </w:num>
 </w:numbering>
 </file>
@@ -2451,6 +3167,33 @@
       <w:spacing w:val="5"/>
     </w:rPr>
   </w:style>
+  <w:style w:type="paragraph" w:styleId="NormalWeb">
+    <w:name w:val="Normal (Web)"/>
+    <w:basedOn w:val="Normal"/>
+    <w:uiPriority w:val="99"/>
+    <w:unhideWhenUsed/>
+    <w:rsid w:val="00AA5B9E"/>
+    <w:pPr>
+      <w:spacing w:before="100" w:beforeAutospacing="1" w:after="100" w:afterAutospacing="1" w:line="240" w:lineRule="auto"/>
+    </w:pPr>
+    <w:rPr>
+      <w:rFonts w:ascii="Times New Roman" w:eastAsia="Times New Roman" w:hAnsi="Times New Roman" w:cs="Times New Roman"/>
+      <w:kern w:val="0"/>
+      <w:lang w:eastAsia="es-CO"/>
+      <w14:ligatures w14:val="none"/>
+    </w:rPr>
+  </w:style>
+  <w:style w:type="character" w:styleId="Textoennegrita">
+    <w:name w:val="Strong"/>
+    <w:basedOn w:val="Fuentedeprrafopredeter"/>
+    <w:uiPriority w:val="22"/>
+    <w:qFormat/>
+    <w:rsid w:val="00AA5B9E"/>
+    <w:rPr>
+      <w:b/>
+      <w:bCs/>
+    </w:rPr>
+  </w:style>
 </w:styles>
 </file>
 

</xml_diff>